<commit_message>
Update resume files (PDF and DOCX)
</commit_message>
<xml_diff>
--- a/assets/rishab_resume.docx
+++ b/assets/rishab_resume.docx
@@ -33,11 +33,19 @@
         <w:spacing w:before="58"/>
         <w:jc w:val="center"/>
       </w:pPr>
-      <w:r>
-        <w:rPr>
-          <w:color w:val="666666"/>
-        </w:rPr>
-        <w:t>Gandhidham,</w:t>
+      <w:proofErr w:type="spellStart"/>
+      <w:r>
+        <w:rPr>
+          <w:color w:val="666666"/>
+        </w:rPr>
+        <w:t>Gandhidham</w:t>
+      </w:r>
+      <w:proofErr w:type="spellEnd"/>
+      <w:r>
+        <w:rPr>
+          <w:color w:val="666666"/>
+        </w:rPr>
+        <w:t>,</w:t>
       </w:r>
       <w:r>
         <w:rPr>
@@ -239,7 +247,7 @@
           </mc:Choice>
           <mc:Fallback>
             <w:pict>
-              <v:shape w14:anchorId="20CE0874" id="Graphic 1" o:spid="_x0000_s1026" style="position:absolute;margin-left:52.55pt;margin-top:13.45pt;width:507pt;height:1.45pt;z-index:-15728640;visibility:visible;mso-wrap-style:square;mso-wrap-distance-left:0;mso-wrap-distance-top:0;mso-wrap-distance-right:0;mso-wrap-distance-bottom:0;mso-position-horizontal:absolute;mso-position-horizontal-relative:page;mso-position-vertical:absolute;mso-position-vertical-relative:text;v-text-anchor:top" coordsize="6438900,18415" o:gfxdata="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" path="m6438645,l,,,18288r6438645,l6438645,xe" fillcolor="black" stroked="f">
+              <v:shape w14:anchorId="56B3F234" id="Graphic 1" o:spid="_x0000_s1026" style="position:absolute;margin-left:52.55pt;margin-top:13.45pt;width:507pt;height:1.45pt;z-index:-15728640;visibility:visible;mso-wrap-style:square;mso-wrap-distance-left:0;mso-wrap-distance-top:0;mso-wrap-distance-right:0;mso-wrap-distance-bottom:0;mso-position-horizontal:absolute;mso-position-horizontal-relative:page;mso-position-vertical:absolute;mso-position-vertical-relative:text;v-text-anchor:top" coordsize="6438900,18415" o:gfxdata="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" path="m6438645,l,,,18288r6438645,l6438645,xe" fillcolor="black" stroked="f">
                 <v:path arrowok="t"/>
                 <w10:wrap type="topAndBottom" anchorx="page"/>
               </v:shape>
@@ -262,9 +270,11 @@
         <w:ind w:left="360" w:right="688"/>
         <w:jc w:val="both"/>
       </w:pPr>
+      <w:proofErr w:type="gramStart"/>
       <w:r>
         <w:t>B.Com</w:t>
       </w:r>
+      <w:proofErr w:type="gramEnd"/>
       <w:r>
         <w:t xml:space="preserve"> graduate with a first-principles approach to analytical problem-solving and systems thinking, combined with AI-native </w:t>
       </w:r>
@@ -275,13 +285,7 @@
         <w:t xml:space="preserve"> Thorough</w:t>
       </w:r>
       <w:r>
-        <w:t xml:space="preserve"> understanding of full-cycle accounting, manufacturing costing, FP&amp;A, shipping and freight analytics, and financial </w:t>
-      </w:r>
-      <w:r>
-        <w:t>markets. Self</w:t>
-      </w:r>
-      <w:r>
-        <w:t>-taught in Python, Excel, data pipelines, and currently developing proficiency in Power BI</w:t>
+        <w:t xml:space="preserve"> understanding of full-cycle accounting, manufacturing costing, FP&amp;A, shipping and freight analytics, and financial markets. Self-taught in Python, Excel, data pipelines, and currently developing proficiency in Power BI</w:t>
       </w:r>
       <w:r>
         <w:t xml:space="preserve"> and other analytical tools.</w:t>
@@ -419,7 +423,13 @@
         <w:rPr>
           <w:sz w:val="18"/>
         </w:rPr>
-        <w:t xml:space="preserve"> Per-TEU P&amp;L for Kandla NVOCC across India-UAE, India–China, India–USA routes; EBITDA, breakeven, and sensitivity analysis</w:t>
+        <w:t xml:space="preserve"> </w:t>
+      </w:r>
+      <w:r>
+        <w:rPr>
+          <w:sz w:val="18"/>
+        </w:rPr>
+        <w:t>Freight forwarding P&amp;L model forecasting revenue, variable costs, and profitability across scenarios, with breakeven, sensitivity analysis, and per-TEU unit economics for pricing and decision-making.</w:t>
       </w:r>
     </w:p>
     <w:p>
@@ -512,6 +522,43 @@
     </w:p>
     <w:p>
       <w:pPr>
+        <w:pStyle w:val="ListParagraph"/>
+        <w:numPr>
+          <w:ilvl w:val="0"/>
+          <w:numId w:val="2"/>
+        </w:numPr>
+        <w:tabs>
+          <w:tab w:val="left" w:pos="720"/>
+        </w:tabs>
+        <w:spacing w:before="24" w:line="235" w:lineRule="auto"/>
+        <w:ind w:right="673"/>
+        <w:rPr>
+          <w:sz w:val="18"/>
+        </w:rPr>
+      </w:pPr>
+      <w:r>
+        <w:rPr>
+          <w:b/>
+          <w:bCs/>
+          <w:sz w:val="18"/>
+        </w:rPr>
+        <w:t xml:space="preserve">Exim documentation Tracker – </w:t>
+      </w:r>
+      <w:r>
+        <w:rPr>
+          <w:sz w:val="18"/>
+        </w:rPr>
+        <w:t>E</w:t>
+      </w:r>
+      <w:r>
+        <w:rPr>
+          <w:sz w:val="18"/>
+        </w:rPr>
+        <w:t>xim documentation tracking dashboard for monitoring shipment status, freight routes, compliance documents, transit progress, and operational bottlenecks.</w:t>
+      </w:r>
+    </w:p>
+    <w:p>
+      <w:pPr>
         <w:spacing w:before="119"/>
         <w:ind w:left="360"/>
         <w:rPr>
@@ -525,16 +572,7 @@
           <w:bCs/>
           <w:sz w:val="19"/>
         </w:rPr>
-        <w:t xml:space="preserve">Financial </w:t>
-      </w:r>
-      <w:r>
-        <w:rPr>
-          <w:rFonts w:ascii="Arial" w:hAnsi="Arial"/>
-          <w:b/>
-          <w:bCs/>
-          <w:sz w:val="19"/>
-        </w:rPr>
-        <w:t>Modelling</w:t>
+        <w:t>Financial Modelling</w:t>
       </w:r>
       <w:r>
         <w:rPr>
@@ -566,14 +604,7 @@
           <w:color w:val="666666"/>
           <w:sz w:val="18"/>
         </w:rPr>
-        <w:t xml:space="preserve"> · NPV · </w:t>
-      </w:r>
-      <w:r>
-        <w:rPr>
-          <w:color w:val="666666"/>
-          <w:sz w:val="18"/>
-        </w:rPr>
-        <w:t>Var</w:t>
+        <w:t xml:space="preserve"> · NPV · Var</w:t>
       </w:r>
     </w:p>
     <w:p>
@@ -617,13 +648,7 @@
         <w:rPr>
           <w:sz w:val="18"/>
         </w:rPr>
-        <w:t>Capex</w:t>
-      </w:r>
-      <w:r>
-        <w:rPr>
-          <w:sz w:val="18"/>
-        </w:rPr>
-        <w:t xml:space="preserve"> decision model with cash flow forecasting, ROI, payback period, and sensitivity analysis</w:t>
+        <w:t>Capex decision model with cash flow forecasting, ROI, payback period, and sensitivity analysis</w:t>
       </w:r>
     </w:p>
     <w:p>
@@ -679,13 +704,7 @@
         <w:rPr>
           <w:sz w:val="18"/>
         </w:rPr>
-        <w:t xml:space="preserve"> P&amp;L, Balance Sheet, and Cash Flow with scenario analysi</w:t>
-      </w:r>
-      <w:r>
-        <w:rPr>
-          <w:sz w:val="18"/>
-        </w:rPr>
-        <w:t>s</w:t>
+        <w:t xml:space="preserve"> P&amp;L, Balance Sheet, and Cash Flow with scenario analysis</w:t>
       </w:r>
       <w:r>
         <w:rPr>
@@ -735,7 +754,21 @@
         <w:rPr>
           <w:sz w:val="18"/>
         </w:rPr>
-        <w:t xml:space="preserve"> FAANG portfolio vs SPX benchmark; Beta, STDEV, Treynor ratio, VaR at 95% &amp; 99% confidenc</w:t>
+        <w:t xml:space="preserve"> FAANG portfolio vs SPX benchmark; Beta, STDEV, Treynor ratio, </w:t>
+      </w:r>
+      <w:proofErr w:type="spellStart"/>
+      <w:r>
+        <w:rPr>
+          <w:sz w:val="18"/>
+        </w:rPr>
+        <w:t>VaR</w:t>
+      </w:r>
+      <w:proofErr w:type="spellEnd"/>
+      <w:r>
+        <w:rPr>
+          <w:sz w:val="18"/>
+        </w:rPr>
+        <w:t xml:space="preserve"> at 95% &amp; 99% confidenc</w:t>
       </w:r>
       <w:r>
         <w:rPr>
@@ -789,7 +822,14 @@
           <w:color w:val="666666"/>
           <w:sz w:val="18"/>
         </w:rPr>
-        <w:t>React · Recharts · Python · n8n</w:t>
+        <w:t xml:space="preserve">React · Recharts · Python · </w:t>
+      </w:r>
+      <w:r>
+        <w:rPr>
+          <w:color w:val="666666"/>
+          <w:sz w:val="18"/>
+        </w:rPr>
+        <w:t>pandas</w:t>
       </w:r>
     </w:p>
     <w:p>
@@ -859,7 +899,25 @@
           <w:bCs/>
           <w:sz w:val="18"/>
         </w:rPr>
-        <w:t>Strategy Backtest Dashboard</w:t>
+        <w:t xml:space="preserve">Strategy </w:t>
+      </w:r>
+      <w:proofErr w:type="spellStart"/>
+      <w:r>
+        <w:rPr>
+          <w:b/>
+          <w:bCs/>
+          <w:sz w:val="18"/>
+        </w:rPr>
+        <w:t>Backtest</w:t>
+      </w:r>
+      <w:proofErr w:type="spellEnd"/>
+      <w:r>
+        <w:rPr>
+          <w:b/>
+          <w:bCs/>
+          <w:sz w:val="18"/>
+        </w:rPr>
+        <w:t xml:space="preserve"> Dashboard</w:t>
       </w:r>
       <w:r>
         <w:rPr>
@@ -877,7 +935,21 @@
         <w:rPr>
           <w:sz w:val="18"/>
         </w:rPr>
-        <w:t xml:space="preserve"> Crypto backtest tool with parameter heatmap, equity curve, drawdown chart, and rolling Sharp</w:t>
+        <w:t xml:space="preserve"> Crypto </w:t>
+      </w:r>
+      <w:proofErr w:type="spellStart"/>
+      <w:r>
+        <w:rPr>
+          <w:sz w:val="18"/>
+        </w:rPr>
+        <w:t>backtest</w:t>
+      </w:r>
+      <w:proofErr w:type="spellEnd"/>
+      <w:r>
+        <w:rPr>
+          <w:sz w:val="18"/>
+        </w:rPr>
+        <w:t xml:space="preserve"> tool with parameter heatmap, equity curve, drawdown chart, and rolling Sharp</w:t>
       </w:r>
       <w:r>
         <w:rPr>
@@ -1034,7 +1106,7 @@
           </mc:Choice>
           <mc:Fallback>
             <w:pict>
-              <v:shape w14:anchorId="68AC23D2" id="Graphic 2" o:spid="_x0000_s1026" style="position:absolute;margin-left:52.55pt;margin-top:13.55pt;width:507pt;height:1.45pt;z-index:-15728128;visibility:visible;mso-wrap-style:square;mso-wrap-distance-left:0;mso-wrap-distance-top:0;mso-wrap-distance-right:0;mso-wrap-distance-bottom:0;mso-position-horizontal:absolute;mso-position-horizontal-relative:page;mso-position-vertical:absolute;mso-position-vertical-relative:text;v-text-anchor:top" coordsize="6438900,18415" o:gfxdata="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" path="m6438645,l,,,18287r6438645,l6438645,xe" fillcolor="black" stroked="f">
+              <v:shape w14:anchorId="72772E81" id="Graphic 2" o:spid="_x0000_s1026" style="position:absolute;margin-left:52.55pt;margin-top:13.55pt;width:507pt;height:1.45pt;z-index:-15728128;visibility:visible;mso-wrap-style:square;mso-wrap-distance-left:0;mso-wrap-distance-top:0;mso-wrap-distance-right:0;mso-wrap-distance-bottom:0;mso-position-horizontal:absolute;mso-position-horizontal-relative:page;mso-position-vertical:absolute;mso-position-vertical-relative:text;v-text-anchor:top" coordsize="6438900,18415" o:gfxdata="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" path="m6438645,l,,,18287r6438645,l6438645,xe" fillcolor="black" stroked="f">
                 <v:path arrowok="t"/>
                 <w10:wrap type="topAndBottom" anchorx="page"/>
               </v:shape>
@@ -1154,17 +1226,16 @@
           <w:color w:val="666666"/>
           <w:sz w:val="18"/>
         </w:rPr>
-        <w:t>Jun</w:t>
+        <w:t xml:space="preserve">April </w:t>
       </w:r>
       <w:r>
         <w:rPr>
           <w:rFonts w:ascii="Arial" w:hAnsi="Arial"/>
           <w:i/>
           <w:color w:val="666666"/>
-          <w:spacing w:val="-3"/>
-          <w:sz w:val="18"/>
-        </w:rPr>
-        <w:t xml:space="preserve"> </w:t>
+          <w:sz w:val="18"/>
+        </w:rPr>
+        <w:t>202</w:t>
       </w:r>
       <w:r>
         <w:rPr>
@@ -1173,17 +1244,45 @@
           <w:color w:val="666666"/>
           <w:sz w:val="18"/>
         </w:rPr>
-        <w:t xml:space="preserve">2022 – Aug </w:t>
+        <w:t>4</w:t>
       </w:r>
       <w:r>
         <w:rPr>
           <w:rFonts w:ascii="Arial" w:hAnsi="Arial"/>
           <w:i/>
           <w:color w:val="666666"/>
+          <w:sz w:val="18"/>
+        </w:rPr>
+        <w:t xml:space="preserve"> – </w:t>
+      </w:r>
+      <w:r>
+        <w:rPr>
+          <w:rFonts w:ascii="Arial" w:hAnsi="Arial"/>
+          <w:i/>
+          <w:color w:val="666666"/>
+          <w:sz w:val="18"/>
+        </w:rPr>
+        <w:t xml:space="preserve">Dec </w:t>
+      </w:r>
+      <w:r>
+        <w:rPr>
+          <w:rFonts w:ascii="Arial" w:hAnsi="Arial"/>
+          <w:i/>
+          <w:color w:val="666666"/>
           <w:spacing w:val="-4"/>
           <w:sz w:val="18"/>
         </w:rPr>
-        <w:t>2022</w:t>
+        <w:t>202</w:t>
+      </w:r>
+      <w:r>
+        <w:rPr>
+          <w:rFonts w:ascii="Arial" w:hAnsi="Arial"/>
+          <w:i/>
+          <w:color w:val="666666"/>
+          <w:spacing w:val="-4"/>
+          <w:sz w:val="18"/>
+        </w:rPr>
+        <w:t>4</w:t>
       </w:r>
     </w:p>
     <w:p>
@@ -2540,6 +2639,7 @@
         </w:rPr>
         <w:t xml:space="preserve"> </w:t>
       </w:r>
+      <w:proofErr w:type="spellStart"/>
       <w:r>
         <w:rPr>
           <w:color w:val="666666"/>
@@ -2547,6 +2647,7 @@
         </w:rPr>
         <w:t>Sharekhan</w:t>
       </w:r>
+      <w:proofErr w:type="spellEnd"/>
       <w:r>
         <w:rPr>
           <w:color w:val="666666"/>
@@ -3181,6 +3282,7 @@
               </w:rPr>
               <w:t xml:space="preserve"> </w:t>
             </w:r>
+            <w:proofErr w:type="spellStart"/>
             <w:r>
               <w:rPr>
                 <w:color w:val="666666"/>
@@ -3189,6 +3291,7 @@
               </w:rPr>
               <w:t>Adipur</w:t>
             </w:r>
+            <w:proofErr w:type="spellEnd"/>
           </w:p>
         </w:tc>
         <w:tc>
@@ -3337,6 +3440,7 @@
               </w:rPr>
               <w:t xml:space="preserve"> </w:t>
             </w:r>
+            <w:proofErr w:type="spellStart"/>
             <w:r>
               <w:rPr>
                 <w:color w:val="666666"/>
@@ -3345,6 +3449,7 @@
               </w:rPr>
               <w:t>Adipur</w:t>
             </w:r>
+            <w:proofErr w:type="spellEnd"/>
           </w:p>
         </w:tc>
         <w:tc>
@@ -4329,6 +4434,19 @@
               <w:rPr>
                 <w:sz w:val="18"/>
               </w:rPr>
+              <w:t xml:space="preserve"> · </w:t>
+            </w:r>
+            <w:r>
+              <w:rPr>
+                <w:sz w:val="18"/>
+              </w:rPr>
+              <w:t>Codex</w:t>
+            </w:r>
+            <w:r>
+              <w:rPr>
+                <w:spacing w:val="-2"/>
+                <w:sz w:val="18"/>
+              </w:rPr>
               <w:t xml:space="preserve"> </w:t>
             </w:r>
             <w:r>
@@ -4339,15 +4457,28 @@
             </w:r>
             <w:r>
               <w:rPr>
-                <w:sz w:val="18"/>
-              </w:rPr>
-              <w:t xml:space="preserve"> </w:t>
-            </w:r>
-            <w:r>
-              <w:rPr>
-                <w:sz w:val="18"/>
-              </w:rPr>
-              <w:t>Codex</w:t>
+                <w:spacing w:val="-3"/>
+                <w:sz w:val="18"/>
+              </w:rPr>
+              <w:t xml:space="preserve"> </w:t>
+            </w:r>
+            <w:r>
+              <w:rPr>
+                <w:sz w:val="18"/>
+              </w:rPr>
+              <w:t>Python Automation</w:t>
+            </w:r>
+            <w:r>
+              <w:rPr>
+                <w:sz w:val="18"/>
+              </w:rPr>
+              <w:t xml:space="preserve">· </w:t>
+            </w:r>
+            <w:r>
+              <w:rPr>
+                <w:sz w:val="18"/>
+              </w:rPr>
+              <w:t>LLM Orchestration</w:t>
             </w:r>
             <w:r>
               <w:rPr>
@@ -4360,84 +4491,29 @@
               <w:rPr>
                 <w:sz w:val="18"/>
               </w:rPr>
-              <w:t>·</w:t>
-            </w:r>
-            <w:r>
-              <w:rPr>
-                <w:spacing w:val="-3"/>
-                <w:sz w:val="18"/>
-              </w:rPr>
-              <w:t xml:space="preserve"> </w:t>
-            </w:r>
-            <w:r>
-              <w:rPr>
-                <w:sz w:val="18"/>
-              </w:rPr>
-              <w:t>Python Automation</w:t>
-            </w:r>
-            <w:r>
-              <w:rPr>
-                <w:sz w:val="18"/>
-              </w:rPr>
-              <w:t>·</w:t>
-            </w:r>
-            <w:r>
-              <w:rPr>
-                <w:sz w:val="18"/>
-              </w:rPr>
-              <w:t xml:space="preserve"> </w:t>
-            </w:r>
-            <w:r>
-              <w:rPr>
-                <w:sz w:val="18"/>
-              </w:rPr>
-              <w:t>LLM Orchestration</w:t>
-            </w:r>
-            <w:r>
-              <w:rPr>
-                <w:spacing w:val="-2"/>
-                <w:sz w:val="18"/>
-              </w:rPr>
-              <w:t xml:space="preserve"> </w:t>
-            </w:r>
-            <w:r>
-              <w:rPr>
-                <w:sz w:val="18"/>
-              </w:rPr>
-              <w:t>·</w:t>
-            </w:r>
-            <w:r>
-              <w:rPr>
-                <w:sz w:val="18"/>
-              </w:rPr>
-              <w:t xml:space="preserve"> </w:t>
+              <w:t xml:space="preserve">· </w:t>
             </w:r>
             <w:r>
               <w:rPr>
                 <w:spacing w:val="-5"/>
                 <w:sz w:val="18"/>
               </w:rPr>
-              <w:t>n8n</w:t>
-            </w:r>
-            <w:r>
-              <w:rPr>
-                <w:spacing w:val="-5"/>
-                <w:sz w:val="18"/>
-              </w:rPr>
-              <w:t xml:space="preserve"> </w:t>
-            </w:r>
-            <w:r>
-              <w:rPr>
-                <w:sz w:val="18"/>
-              </w:rPr>
-              <w:t>·</w:t>
-            </w:r>
-            <w:r>
-              <w:rPr>
-                <w:sz w:val="18"/>
-              </w:rPr>
-              <w:t xml:space="preserve"> Ollama</w:t>
-            </w:r>
+              <w:t xml:space="preserve">n8n </w:t>
+            </w:r>
+            <w:r>
+              <w:rPr>
+                <w:sz w:val="18"/>
+              </w:rPr>
+              <w:t xml:space="preserve">· </w:t>
+            </w:r>
+            <w:proofErr w:type="spellStart"/>
+            <w:r>
+              <w:rPr>
+                <w:sz w:val="18"/>
+              </w:rPr>
+              <w:t>Ollama</w:t>
+            </w:r>
+            <w:proofErr w:type="spellEnd"/>
           </w:p>
         </w:tc>
       </w:tr>
@@ -5808,8 +5884,16 @@
         <w:rPr>
           <w:sz w:val="18"/>
         </w:rPr>
-        <w:t>Binance/Bybit</w:t>
-      </w:r>
+        <w:t>Binance/</w:t>
+      </w:r>
+      <w:proofErr w:type="spellStart"/>
+      <w:r>
+        <w:rPr>
+          <w:sz w:val="18"/>
+        </w:rPr>
+        <w:t>Bybit</w:t>
+      </w:r>
+      <w:proofErr w:type="spellEnd"/>
       <w:r>
         <w:rPr>
           <w:spacing w:val="-3"/>

</xml_diff>

<commit_message>
Update resumes and add AP/AR O2C Analytics project
</commit_message>
<xml_diff>
--- a/assets/rishab_resume.docx
+++ b/assets/rishab_resume.docx
@@ -247,7 +247,7 @@
           </mc:Choice>
           <mc:Fallback>
             <w:pict>
-              <v:shape w14:anchorId="56B3F234" id="Graphic 1" o:spid="_x0000_s1026" style="position:absolute;margin-left:52.55pt;margin-top:13.45pt;width:507pt;height:1.45pt;z-index:-15728640;visibility:visible;mso-wrap-style:square;mso-wrap-distance-left:0;mso-wrap-distance-top:0;mso-wrap-distance-right:0;mso-wrap-distance-bottom:0;mso-position-horizontal:absolute;mso-position-horizontal-relative:page;mso-position-vertical:absolute;mso-position-vertical-relative:text;v-text-anchor:top" coordsize="6438900,18415" o:gfxdata="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" path="m6438645,l,,,18288r6438645,l6438645,xe" fillcolor="black" stroked="f">
+              <v:shape w14:anchorId="26782816" id="Graphic 1" o:spid="_x0000_s1026" style="position:absolute;margin-left:52.55pt;margin-top:13.45pt;width:507pt;height:1.45pt;z-index:-15728640;visibility:visible;mso-wrap-style:square;mso-wrap-distance-left:0;mso-wrap-distance-top:0;mso-wrap-distance-right:0;mso-wrap-distance-bottom:0;mso-position-horizontal:absolute;mso-position-horizontal-relative:page;mso-position-vertical:absolute;mso-position-vertical-relative:text;v-text-anchor:top" coordsize="6438900,18415" o:gfxdata="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" path="m6438645,l,,,18288r6438645,l6438645,xe" fillcolor="black" stroked="f">
                 <v:path arrowok="t"/>
                 <w10:wrap type="topAndBottom" anchorx="page"/>
               </v:shape>
@@ -630,7 +630,31 @@
           <w:bCs/>
           <w:sz w:val="18"/>
         </w:rPr>
-        <w:t>Machine Investment Model</w:t>
+        <w:t xml:space="preserve">Machine Investment </w:t>
+      </w:r>
+      <w:r>
+        <w:rPr>
+          <w:b/>
+          <w:bCs/>
+          <w:sz w:val="18"/>
+        </w:rPr>
+        <w:t>Model</w:t>
+      </w:r>
+      <w:r>
+        <w:rPr>
+          <w:b/>
+          <w:bCs/>
+          <w:sz w:val="18"/>
+        </w:rPr>
+        <w:t xml:space="preserve"> (</w:t>
+      </w:r>
+      <w:r>
+        <w:rPr>
+          <w:b/>
+          <w:bCs/>
+          <w:sz w:val="18"/>
+        </w:rPr>
+        <w:t>in progress)</w:t>
       </w:r>
       <w:r>
         <w:rPr>
@@ -1106,7 +1130,7 @@
           </mc:Choice>
           <mc:Fallback>
             <w:pict>
-              <v:shape w14:anchorId="72772E81" id="Graphic 2" o:spid="_x0000_s1026" style="position:absolute;margin-left:52.55pt;margin-top:13.55pt;width:507pt;height:1.45pt;z-index:-15728128;visibility:visible;mso-wrap-style:square;mso-wrap-distance-left:0;mso-wrap-distance-top:0;mso-wrap-distance-right:0;mso-wrap-distance-bottom:0;mso-position-horizontal:absolute;mso-position-horizontal-relative:page;mso-position-vertical:absolute;mso-position-vertical-relative:text;v-text-anchor:top" coordsize="6438900,18415" o:gfxdata="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" path="m6438645,l,,,18287r6438645,l6438645,xe" fillcolor="black" stroked="f">
+              <v:shape w14:anchorId="3445CCEF" id="Graphic 2" o:spid="_x0000_s1026" style="position:absolute;margin-left:52.55pt;margin-top:13.55pt;width:507pt;height:1.45pt;z-index:-15728128;visibility:visible;mso-wrap-style:square;mso-wrap-distance-left:0;mso-wrap-distance-top:0;mso-wrap-distance-right:0;mso-wrap-distance-bottom:0;mso-position-horizontal:absolute;mso-position-horizontal-relative:page;mso-position-vertical:absolute;mso-position-vertical-relative:text;v-text-anchor:top" coordsize="6438900,18415" o:gfxdata="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" path="m6438645,l,,,18287r6438645,l6438645,xe" fillcolor="black" stroked="f">
                 <v:path arrowok="t"/>
                 <w10:wrap type="topAndBottom" anchorx="page"/>
               </v:shape>
@@ -6819,6 +6843,7 @@
   <w:style w:type="character" w:default="1" w:styleId="DefaultParagraphFont">
     <w:name w:val="Default Paragraph Font"/>
     <w:uiPriority w:val="1"/>
+    <w:semiHidden/>
     <w:unhideWhenUsed/>
   </w:style>
   <w:style w:type="table" w:default="1" w:styleId="TableNormal">

</xml_diff>

<commit_message>
Hide Wholesale Distribution experience and update resume
</commit_message>
<xml_diff>
--- a/assets/rishab_resume.docx
+++ b/assets/rishab_resume.docx
@@ -33,19 +33,11 @@
         <w:spacing w:before="58"/>
         <w:jc w:val="center"/>
       </w:pPr>
-      <w:proofErr w:type="spellStart"/>
       <w:r>
         <w:rPr>
           <w:color w:val="666666"/>
         </w:rPr>
-        <w:t>Gandhidham</w:t>
-      </w:r>
-      <w:proofErr w:type="spellEnd"/>
-      <w:r>
-        <w:rPr>
-          <w:color w:val="666666"/>
-        </w:rPr>
-        <w:t>,</w:t>
+        <w:t>Gandhidham,</w:t>
       </w:r>
       <w:r>
         <w:rPr>
@@ -64,74 +56,6 @@
         <w:rPr>
           <w:color w:val="666666"/>
           <w:spacing w:val="-3"/>
-        </w:rPr>
-        <w:t xml:space="preserve"> </w:t>
-      </w:r>
-      <w:r>
-        <w:rPr>
-          <w:color w:val="666666"/>
-        </w:rPr>
-        <w:t>|</w:t>
-      </w:r>
-      <w:r>
-        <w:rPr>
-          <w:color w:val="666666"/>
-          <w:spacing w:val="-5"/>
-        </w:rPr>
-        <w:t xml:space="preserve"> </w:t>
-      </w:r>
-      <w:r>
-        <w:rPr>
-          <w:color w:val="666666"/>
-        </w:rPr>
-        <w:t>+91</w:t>
-      </w:r>
-      <w:r>
-        <w:rPr>
-          <w:color w:val="666666"/>
-          <w:spacing w:val="-4"/>
-        </w:rPr>
-        <w:t xml:space="preserve"> </w:t>
-      </w:r>
-      <w:r>
-        <w:rPr>
-          <w:color w:val="666666"/>
-        </w:rPr>
-        <w:t>9664782754</w:t>
-      </w:r>
-      <w:r>
-        <w:rPr>
-          <w:color w:val="666666"/>
-          <w:spacing w:val="-3"/>
-        </w:rPr>
-        <w:t xml:space="preserve"> </w:t>
-      </w:r>
-      <w:r>
-        <w:rPr>
-          <w:color w:val="666666"/>
-        </w:rPr>
-        <w:t>|</w:t>
-      </w:r>
-      <w:r>
-        <w:rPr>
-          <w:color w:val="666666"/>
-          <w:spacing w:val="45"/>
-        </w:rPr>
-        <w:t xml:space="preserve"> </w:t>
-      </w:r>
-      <w:hyperlink r:id="rId5">
-        <w:r>
-          <w:rPr>
-            <w:color w:val="0462C1"/>
-            <w:u w:val="single" w:color="0462C1"/>
-          </w:rPr>
-          <w:t>rishabkariya22@gmail.com</w:t>
-        </w:r>
-      </w:hyperlink>
-      <w:r>
-        <w:rPr>
-          <w:color w:val="0462C1"/>
-          <w:spacing w:val="1"/>
         </w:rPr>
         <w:t xml:space="preserve"> </w:t>
       </w:r>
@@ -247,7 +171,7 @@
           </mc:Choice>
           <mc:Fallback>
             <w:pict>
-              <v:shape w14:anchorId="26782816" id="Graphic 1" o:spid="_x0000_s1026" style="position:absolute;margin-left:52.55pt;margin-top:13.45pt;width:507pt;height:1.45pt;z-index:-15728640;visibility:visible;mso-wrap-style:square;mso-wrap-distance-left:0;mso-wrap-distance-top:0;mso-wrap-distance-right:0;mso-wrap-distance-bottom:0;mso-position-horizontal:absolute;mso-position-horizontal-relative:page;mso-position-vertical:absolute;mso-position-vertical-relative:text;v-text-anchor:top" coordsize="6438900,18415" o:gfxdata="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" path="m6438645,l,,,18288r6438645,l6438645,xe" fillcolor="black" stroked="f">
+              <v:shape w14:anchorId="1BEF48CD" id="Graphic 1" o:spid="_x0000_s1026" style="position:absolute;margin-left:52.55pt;margin-top:13.45pt;width:507pt;height:1.45pt;z-index:-15728640;visibility:visible;mso-wrap-style:square;mso-wrap-distance-left:0;mso-wrap-distance-top:0;mso-wrap-distance-right:0;mso-wrap-distance-bottom:0;mso-position-horizontal:absolute;mso-position-horizontal-relative:page;mso-position-vertical:absolute;mso-position-vertical-relative:text;v-text-anchor:top" coordsize="6438900,18415" o:gfxdata="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" path="m6438645,l,,,18288r6438645,l6438645,xe" fillcolor="black" stroked="f">
                 <v:path arrowok="t"/>
                 <w10:wrap type="topAndBottom" anchorx="page"/>
               </v:shape>
@@ -270,11 +194,9 @@
         <w:ind w:left="360" w:right="688"/>
         <w:jc w:val="both"/>
       </w:pPr>
-      <w:proofErr w:type="gramStart"/>
       <w:r>
         <w:t>B.Com</w:t>
       </w:r>
-      <w:proofErr w:type="gramEnd"/>
       <w:r>
         <w:t xml:space="preserve"> graduate with a first-principles approach to analytical problem-solving and systems thinking, combined with AI-native </w:t>
       </w:r>
@@ -778,21 +700,7 @@
         <w:rPr>
           <w:sz w:val="18"/>
         </w:rPr>
-        <w:t xml:space="preserve"> FAANG portfolio vs SPX benchmark; Beta, STDEV, Treynor ratio, </w:t>
-      </w:r>
-      <w:proofErr w:type="spellStart"/>
-      <w:r>
-        <w:rPr>
-          <w:sz w:val="18"/>
-        </w:rPr>
-        <w:t>VaR</w:t>
-      </w:r>
-      <w:proofErr w:type="spellEnd"/>
-      <w:r>
-        <w:rPr>
-          <w:sz w:val="18"/>
-        </w:rPr>
-        <w:t xml:space="preserve"> at 95% &amp; 99% confidenc</w:t>
+        <w:t xml:space="preserve"> FAANG portfolio vs SPX benchmark; Beta, STDEV, Treynor ratio, VaR at 95% &amp; 99% confidenc</w:t>
       </w:r>
       <w:r>
         <w:rPr>
@@ -923,25 +831,7 @@
           <w:bCs/>
           <w:sz w:val="18"/>
         </w:rPr>
-        <w:t xml:space="preserve">Strategy </w:t>
-      </w:r>
-      <w:proofErr w:type="spellStart"/>
-      <w:r>
-        <w:rPr>
-          <w:b/>
-          <w:bCs/>
-          <w:sz w:val="18"/>
-        </w:rPr>
-        <w:t>Backtest</w:t>
-      </w:r>
-      <w:proofErr w:type="spellEnd"/>
-      <w:r>
-        <w:rPr>
-          <w:b/>
-          <w:bCs/>
-          <w:sz w:val="18"/>
-        </w:rPr>
-        <w:t xml:space="preserve"> Dashboard</w:t>
+        <w:t>Strategy Backtest Dashboard</w:t>
       </w:r>
       <w:r>
         <w:rPr>
@@ -959,21 +849,7 @@
         <w:rPr>
           <w:sz w:val="18"/>
         </w:rPr>
-        <w:t xml:space="preserve"> Crypto </w:t>
-      </w:r>
-      <w:proofErr w:type="spellStart"/>
-      <w:r>
-        <w:rPr>
-          <w:sz w:val="18"/>
-        </w:rPr>
-        <w:t>backtest</w:t>
-      </w:r>
-      <w:proofErr w:type="spellEnd"/>
-      <w:r>
-        <w:rPr>
-          <w:sz w:val="18"/>
-        </w:rPr>
-        <w:t xml:space="preserve"> tool with parameter heatmap, equity curve, drawdown chart, and rolling Sharp</w:t>
+        <w:t xml:space="preserve"> Crypto backtest tool with parameter heatmap, equity curve, drawdown chart, and rolling Sharp</w:t>
       </w:r>
       <w:r>
         <w:rPr>
@@ -1130,7 +1006,7 @@
           </mc:Choice>
           <mc:Fallback>
             <w:pict>
-              <v:shape w14:anchorId="3445CCEF" id="Graphic 2" o:spid="_x0000_s1026" style="position:absolute;margin-left:52.55pt;margin-top:13.55pt;width:507pt;height:1.45pt;z-index:-15728128;visibility:visible;mso-wrap-style:square;mso-wrap-distance-left:0;mso-wrap-distance-top:0;mso-wrap-distance-right:0;mso-wrap-distance-bottom:0;mso-position-horizontal:absolute;mso-position-horizontal-relative:page;mso-position-vertical:absolute;mso-position-vertical-relative:text;v-text-anchor:top" coordsize="6438900,18415" o:gfxdata="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" path="m6438645,l,,,18287r6438645,l6438645,xe" fillcolor="black" stroked="f">
+              <v:shape w14:anchorId="4E25B02E" id="Graphic 2" o:spid="_x0000_s1026" style="position:absolute;margin-left:52.55pt;margin-top:13.55pt;width:507pt;height:1.45pt;z-index:-15728128;visibility:visible;mso-wrap-style:square;mso-wrap-distance-left:0;mso-wrap-distance-top:0;mso-wrap-distance-right:0;mso-wrap-distance-bottom:0;mso-position-horizontal:absolute;mso-position-horizontal-relative:page;mso-position-vertical:absolute;mso-position-vertical-relative:text;v-text-anchor:top" coordsize="6438900,18415" o:gfxdata="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" path="m6438645,l,,,18287r6438645,l6438645,xe" fillcolor="black" stroked="f">
                 <v:path arrowok="t"/>
                 <w10:wrap type="topAndBottom" anchorx="page"/>
               </v:shape>
@@ -1157,511 +1033,6 @@
           <w:spacing w:val="-2"/>
         </w:rPr>
         <w:t>EXPERIENCE</w:t>
-      </w:r>
-    </w:p>
-    <w:p>
-      <w:pPr>
-        <w:tabs>
-          <w:tab w:val="left" w:pos="8010"/>
-        </w:tabs>
-        <w:spacing w:before="163"/>
-        <w:ind w:left="360"/>
-        <w:rPr>
-          <w:rFonts w:ascii="Arial" w:hAnsi="Arial"/>
-          <w:i/>
-          <w:sz w:val="18"/>
-        </w:rPr>
-      </w:pPr>
-      <w:r>
-        <w:rPr>
-          <w:rFonts w:ascii="Arial" w:hAnsi="Arial"/>
-          <w:b/>
-          <w:sz w:val="20"/>
-        </w:rPr>
-        <w:t>Wholesale</w:t>
-      </w:r>
-      <w:r>
-        <w:rPr>
-          <w:rFonts w:ascii="Arial" w:hAnsi="Arial"/>
-          <w:b/>
-          <w:spacing w:val="-10"/>
-          <w:sz w:val="20"/>
-        </w:rPr>
-        <w:t xml:space="preserve"> </w:t>
-      </w:r>
-      <w:r>
-        <w:rPr>
-          <w:rFonts w:ascii="Arial" w:hAnsi="Arial"/>
-          <w:b/>
-          <w:sz w:val="20"/>
-        </w:rPr>
-        <w:t>Distribution</w:t>
-      </w:r>
-      <w:r>
-        <w:rPr>
-          <w:rFonts w:ascii="Arial" w:hAnsi="Arial"/>
-          <w:b/>
-          <w:spacing w:val="-7"/>
-          <w:sz w:val="20"/>
-        </w:rPr>
-        <w:t xml:space="preserve"> </w:t>
-      </w:r>
-      <w:r>
-        <w:rPr>
-          <w:color w:val="666666"/>
-          <w:sz w:val="20"/>
-        </w:rPr>
-        <w:t>|</w:t>
-      </w:r>
-      <w:r>
-        <w:rPr>
-          <w:color w:val="666666"/>
-          <w:spacing w:val="-10"/>
-          <w:sz w:val="20"/>
-        </w:rPr>
-        <w:t xml:space="preserve"> </w:t>
-      </w:r>
-      <w:r>
-        <w:rPr>
-          <w:color w:val="666666"/>
-          <w:sz w:val="20"/>
-        </w:rPr>
-        <w:t>Self-</w:t>
-      </w:r>
-      <w:r>
-        <w:rPr>
-          <w:color w:val="666666"/>
-          <w:spacing w:val="-2"/>
-          <w:sz w:val="20"/>
-        </w:rPr>
-        <w:t>Employed</w:t>
-      </w:r>
-      <w:r>
-        <w:rPr>
-          <w:color w:val="666666"/>
-          <w:sz w:val="20"/>
-        </w:rPr>
-        <w:tab/>
-      </w:r>
-      <w:r>
-        <w:rPr>
-          <w:rFonts w:ascii="Arial" w:hAnsi="Arial"/>
-          <w:i/>
-          <w:color w:val="666666"/>
-          <w:sz w:val="18"/>
-        </w:rPr>
-        <w:t xml:space="preserve">April </w:t>
-      </w:r>
-      <w:r>
-        <w:rPr>
-          <w:rFonts w:ascii="Arial" w:hAnsi="Arial"/>
-          <w:i/>
-          <w:color w:val="666666"/>
-          <w:sz w:val="18"/>
-        </w:rPr>
-        <w:t>202</w:t>
-      </w:r>
-      <w:r>
-        <w:rPr>
-          <w:rFonts w:ascii="Arial" w:hAnsi="Arial"/>
-          <w:i/>
-          <w:color w:val="666666"/>
-          <w:sz w:val="18"/>
-        </w:rPr>
-        <w:t>4</w:t>
-      </w:r>
-      <w:r>
-        <w:rPr>
-          <w:rFonts w:ascii="Arial" w:hAnsi="Arial"/>
-          <w:i/>
-          <w:color w:val="666666"/>
-          <w:sz w:val="18"/>
-        </w:rPr>
-        <w:t xml:space="preserve"> – </w:t>
-      </w:r>
-      <w:r>
-        <w:rPr>
-          <w:rFonts w:ascii="Arial" w:hAnsi="Arial"/>
-          <w:i/>
-          <w:color w:val="666666"/>
-          <w:sz w:val="18"/>
-        </w:rPr>
-        <w:t xml:space="preserve">Dec </w:t>
-      </w:r>
-      <w:r>
-        <w:rPr>
-          <w:rFonts w:ascii="Arial" w:hAnsi="Arial"/>
-          <w:i/>
-          <w:color w:val="666666"/>
-          <w:spacing w:val="-4"/>
-          <w:sz w:val="18"/>
-        </w:rPr>
-        <w:t>202</w:t>
-      </w:r>
-      <w:r>
-        <w:rPr>
-          <w:rFonts w:ascii="Arial" w:hAnsi="Arial"/>
-          <w:i/>
-          <w:color w:val="666666"/>
-          <w:spacing w:val="-4"/>
-          <w:sz w:val="18"/>
-        </w:rPr>
-        <w:t>4</w:t>
-      </w:r>
-    </w:p>
-    <w:p>
-      <w:pPr>
-        <w:pStyle w:val="ListParagraph"/>
-        <w:numPr>
-          <w:ilvl w:val="0"/>
-          <w:numId w:val="2"/>
-        </w:numPr>
-        <w:tabs>
-          <w:tab w:val="left" w:pos="719"/>
-        </w:tabs>
-        <w:spacing w:before="30"/>
-        <w:ind w:left="719" w:hanging="220"/>
-        <w:rPr>
-          <w:rFonts w:ascii="Times New Roman" w:hAnsi="Times New Roman"/>
-          <w:sz w:val="20"/>
-        </w:rPr>
-      </w:pPr>
-      <w:r>
-        <w:rPr>
-          <w:sz w:val="18"/>
-        </w:rPr>
-        <w:t>Sourced</w:t>
-      </w:r>
-      <w:r>
-        <w:rPr>
-          <w:spacing w:val="-11"/>
-          <w:sz w:val="18"/>
-        </w:rPr>
-        <w:t xml:space="preserve"> </w:t>
-      </w:r>
-      <w:r>
-        <w:rPr>
-          <w:sz w:val="18"/>
-        </w:rPr>
-        <w:t>and</w:t>
-      </w:r>
-      <w:r>
-        <w:rPr>
-          <w:spacing w:val="-9"/>
-          <w:sz w:val="18"/>
-        </w:rPr>
-        <w:t xml:space="preserve"> </w:t>
-      </w:r>
-      <w:r>
-        <w:rPr>
-          <w:sz w:val="18"/>
-        </w:rPr>
-        <w:t>sold</w:t>
-      </w:r>
-      <w:r>
-        <w:rPr>
-          <w:spacing w:val="-11"/>
-          <w:sz w:val="18"/>
-        </w:rPr>
-        <w:t xml:space="preserve"> </w:t>
-      </w:r>
-      <w:r>
-        <w:rPr>
-          <w:sz w:val="18"/>
-        </w:rPr>
-        <w:t>₹1L+</w:t>
-      </w:r>
-      <w:r>
-        <w:rPr>
-          <w:spacing w:val="-10"/>
-          <w:sz w:val="18"/>
-        </w:rPr>
-        <w:t xml:space="preserve"> </w:t>
-      </w:r>
-      <w:r>
-        <w:rPr>
-          <w:sz w:val="18"/>
-        </w:rPr>
-        <w:t>of</w:t>
-      </w:r>
-      <w:r>
-        <w:rPr>
-          <w:spacing w:val="-9"/>
-          <w:sz w:val="18"/>
-        </w:rPr>
-        <w:t xml:space="preserve"> </w:t>
-      </w:r>
-      <w:r>
-        <w:rPr>
-          <w:sz w:val="18"/>
-        </w:rPr>
-        <w:t>footwear</w:t>
-      </w:r>
-      <w:r>
-        <w:rPr>
-          <w:spacing w:val="-9"/>
-          <w:sz w:val="18"/>
-        </w:rPr>
-        <w:t xml:space="preserve"> </w:t>
-      </w:r>
-      <w:r>
-        <w:rPr>
-          <w:sz w:val="18"/>
-        </w:rPr>
-        <w:t>and</w:t>
-      </w:r>
-      <w:r>
-        <w:rPr>
-          <w:spacing w:val="-10"/>
-          <w:sz w:val="18"/>
-        </w:rPr>
-        <w:t xml:space="preserve"> </w:t>
-      </w:r>
-      <w:r>
-        <w:rPr>
-          <w:sz w:val="18"/>
-        </w:rPr>
-        <w:t>apparel</w:t>
-      </w:r>
-      <w:r>
-        <w:rPr>
-          <w:spacing w:val="-11"/>
-          <w:sz w:val="18"/>
-        </w:rPr>
-        <w:t xml:space="preserve"> </w:t>
-      </w:r>
-      <w:r>
-        <w:rPr>
-          <w:sz w:val="18"/>
-        </w:rPr>
-        <w:t>goods</w:t>
-      </w:r>
-      <w:r>
-        <w:rPr>
-          <w:spacing w:val="-9"/>
-          <w:sz w:val="18"/>
-        </w:rPr>
-        <w:t xml:space="preserve"> </w:t>
-      </w:r>
-      <w:r>
-        <w:rPr>
-          <w:sz w:val="18"/>
-        </w:rPr>
-        <w:t>independently</w:t>
-      </w:r>
-      <w:r>
-        <w:rPr>
-          <w:spacing w:val="-11"/>
-          <w:sz w:val="18"/>
-        </w:rPr>
-        <w:t xml:space="preserve"> </w:t>
-      </w:r>
-      <w:r>
-        <w:rPr>
-          <w:sz w:val="18"/>
-        </w:rPr>
-        <w:t>with</w:t>
-      </w:r>
-      <w:r>
-        <w:rPr>
-          <w:spacing w:val="-10"/>
-          <w:sz w:val="18"/>
-        </w:rPr>
-        <w:t xml:space="preserve"> </w:t>
-      </w:r>
-      <w:r>
-        <w:rPr>
-          <w:sz w:val="18"/>
-        </w:rPr>
-        <w:t>limited</w:t>
-      </w:r>
-      <w:r>
-        <w:rPr>
-          <w:spacing w:val="-9"/>
-          <w:sz w:val="18"/>
-        </w:rPr>
-        <w:t xml:space="preserve"> </w:t>
-      </w:r>
-      <w:r>
-        <w:rPr>
-          <w:sz w:val="18"/>
-        </w:rPr>
-        <w:t>working</w:t>
-      </w:r>
-      <w:r>
-        <w:rPr>
-          <w:spacing w:val="-10"/>
-          <w:sz w:val="18"/>
-        </w:rPr>
-        <w:t xml:space="preserve"> </w:t>
-      </w:r>
-      <w:r>
-        <w:rPr>
-          <w:spacing w:val="-2"/>
-          <w:sz w:val="18"/>
-        </w:rPr>
-        <w:t>capital</w:t>
-      </w:r>
-    </w:p>
-    <w:p>
-      <w:pPr>
-        <w:pStyle w:val="ListParagraph"/>
-        <w:numPr>
-          <w:ilvl w:val="0"/>
-          <w:numId w:val="2"/>
-        </w:numPr>
-        <w:tabs>
-          <w:tab w:val="left" w:pos="719"/>
-        </w:tabs>
-        <w:spacing w:before="14"/>
-        <w:ind w:left="719" w:hanging="220"/>
-        <w:rPr>
-          <w:rFonts w:ascii="Times New Roman" w:hAnsi="Times New Roman"/>
-          <w:sz w:val="20"/>
-        </w:rPr>
-      </w:pPr>
-      <w:r>
-        <w:rPr>
-          <w:sz w:val="18"/>
-        </w:rPr>
-        <w:t>Managed</w:t>
-      </w:r>
-      <w:r>
-        <w:rPr>
-          <w:spacing w:val="-7"/>
-          <w:sz w:val="18"/>
-        </w:rPr>
-        <w:t xml:space="preserve"> </w:t>
-      </w:r>
-      <w:r>
-        <w:rPr>
-          <w:sz w:val="18"/>
-        </w:rPr>
-        <w:t>procurement,</w:t>
-      </w:r>
-      <w:r>
-        <w:rPr>
-          <w:spacing w:val="-5"/>
-          <w:sz w:val="18"/>
-        </w:rPr>
-        <w:t xml:space="preserve"> </w:t>
-      </w:r>
-      <w:r>
-        <w:rPr>
-          <w:sz w:val="18"/>
-        </w:rPr>
-        <w:t>vendor</w:t>
-      </w:r>
-      <w:r>
-        <w:rPr>
-          <w:spacing w:val="-2"/>
-          <w:sz w:val="18"/>
-        </w:rPr>
-        <w:t xml:space="preserve"> </w:t>
-      </w:r>
-      <w:r>
-        <w:rPr>
-          <w:sz w:val="18"/>
-        </w:rPr>
-        <w:t>negotiation,</w:t>
-      </w:r>
-      <w:r>
-        <w:rPr>
-          <w:spacing w:val="-5"/>
-          <w:sz w:val="18"/>
-        </w:rPr>
-        <w:t xml:space="preserve"> </w:t>
-      </w:r>
-      <w:r>
-        <w:rPr>
-          <w:sz w:val="18"/>
-        </w:rPr>
-        <w:t>inventory,</w:t>
-      </w:r>
-      <w:r>
-        <w:rPr>
-          <w:spacing w:val="-4"/>
-          <w:sz w:val="18"/>
-        </w:rPr>
-        <w:t xml:space="preserve"> </w:t>
-      </w:r>
-      <w:r>
-        <w:rPr>
-          <w:sz w:val="18"/>
-        </w:rPr>
-        <w:t>and</w:t>
-      </w:r>
-      <w:r>
-        <w:rPr>
-          <w:spacing w:val="-3"/>
-          <w:sz w:val="18"/>
-        </w:rPr>
-        <w:t xml:space="preserve"> </w:t>
-      </w:r>
-      <w:r>
-        <w:rPr>
-          <w:sz w:val="18"/>
-        </w:rPr>
-        <w:t>working</w:t>
-      </w:r>
-      <w:r>
-        <w:rPr>
-          <w:spacing w:val="-2"/>
-          <w:sz w:val="18"/>
-        </w:rPr>
-        <w:t xml:space="preserve"> </w:t>
-      </w:r>
-      <w:r>
-        <w:rPr>
-          <w:sz w:val="18"/>
-        </w:rPr>
-        <w:t>capital</w:t>
-      </w:r>
-      <w:r>
-        <w:rPr>
-          <w:spacing w:val="-5"/>
-          <w:sz w:val="18"/>
-        </w:rPr>
-        <w:t xml:space="preserve"> </w:t>
-      </w:r>
-      <w:r>
-        <w:rPr>
-          <w:sz w:val="18"/>
-        </w:rPr>
-        <w:t>allocation</w:t>
-      </w:r>
-      <w:r>
-        <w:rPr>
-          <w:spacing w:val="-4"/>
-          <w:sz w:val="18"/>
-        </w:rPr>
-        <w:t xml:space="preserve"> </w:t>
-      </w:r>
-      <w:r>
-        <w:rPr>
-          <w:sz w:val="18"/>
-        </w:rPr>
-        <w:t>under</w:t>
-      </w:r>
-      <w:r>
-        <w:rPr>
-          <w:spacing w:val="-5"/>
-          <w:sz w:val="18"/>
-        </w:rPr>
-        <w:t xml:space="preserve"> </w:t>
-      </w:r>
-      <w:r>
-        <w:rPr>
-          <w:sz w:val="18"/>
-        </w:rPr>
-        <w:t>cash</w:t>
-      </w:r>
-      <w:r>
-        <w:rPr>
-          <w:spacing w:val="-2"/>
-          <w:sz w:val="18"/>
-        </w:rPr>
-        <w:t xml:space="preserve"> constraints</w:t>
       </w:r>
     </w:p>
     <w:p>
@@ -2663,7 +2034,6 @@
         </w:rPr>
         <w:t xml:space="preserve"> </w:t>
       </w:r>
-      <w:proofErr w:type="spellStart"/>
       <w:r>
         <w:rPr>
           <w:color w:val="666666"/>
@@ -2671,7 +2041,6 @@
         </w:rPr>
         <w:t>Sharekhan</w:t>
       </w:r>
-      <w:proofErr w:type="spellEnd"/>
       <w:r>
         <w:rPr>
           <w:color w:val="666666"/>
@@ -3306,7 +2675,6 @@
               </w:rPr>
               <w:t xml:space="preserve"> </w:t>
             </w:r>
-            <w:proofErr w:type="spellStart"/>
             <w:r>
               <w:rPr>
                 <w:color w:val="666666"/>
@@ -3315,7 +2683,6 @@
               </w:rPr>
               <w:t>Adipur</w:t>
             </w:r>
-            <w:proofErr w:type="spellEnd"/>
           </w:p>
         </w:tc>
         <w:tc>
@@ -3464,7 +2831,6 @@
               </w:rPr>
               <w:t xml:space="preserve"> </w:t>
             </w:r>
-            <w:proofErr w:type="spellStart"/>
             <w:r>
               <w:rPr>
                 <w:color w:val="666666"/>
@@ -3473,7 +2839,6 @@
               </w:rPr>
               <w:t>Adipur</w:t>
             </w:r>
-            <w:proofErr w:type="spellEnd"/>
           </w:p>
         </w:tc>
         <w:tc>
@@ -4528,16 +3893,8 @@
               <w:rPr>
                 <w:sz w:val="18"/>
               </w:rPr>
-              <w:t xml:space="preserve">· </w:t>
-            </w:r>
-            <w:proofErr w:type="spellStart"/>
-            <w:r>
-              <w:rPr>
-                <w:sz w:val="18"/>
-              </w:rPr>
-              <w:t>Ollama</w:t>
-            </w:r>
-            <w:proofErr w:type="spellEnd"/>
+              <w:t>· Ollama</w:t>
+            </w:r>
           </w:p>
         </w:tc>
       </w:tr>
@@ -4952,7 +4309,7 @@
                 <w:sz w:val="19"/>
               </w:rPr>
             </w:pPr>
-            <w:hyperlink r:id="rId6">
+            <w:hyperlink r:id="rId5">
               <w:r>
                 <w:rPr>
                   <w:rFonts w:ascii="Arial"/>
@@ -5177,7 +4534,7 @@
                 <w:sz w:val="19"/>
               </w:rPr>
             </w:pPr>
-            <w:hyperlink r:id="rId7">
+            <w:hyperlink r:id="rId6">
               <w:r>
                 <w:rPr>
                   <w:rFonts w:ascii="Arial"/>
@@ -5431,7 +4788,7 @@
                 <w:sz w:val="19"/>
               </w:rPr>
             </w:pPr>
-            <w:hyperlink r:id="rId8">
+            <w:hyperlink r:id="rId7">
               <w:r>
                 <w:rPr>
                   <w:rFonts w:ascii="Arial"/>
@@ -5908,16 +5265,8 @@
         <w:rPr>
           <w:sz w:val="18"/>
         </w:rPr>
-        <w:t>Binance/</w:t>
-      </w:r>
-      <w:proofErr w:type="spellStart"/>
-      <w:r>
-        <w:rPr>
-          <w:sz w:val="18"/>
-        </w:rPr>
-        <w:t>Bybit</w:t>
-      </w:r>
-      <w:proofErr w:type="spellEnd"/>
+        <w:t>Binance/Bybit</w:t>
+      </w:r>
       <w:r>
         <w:rPr>
           <w:spacing w:val="-3"/>

</xml_diff>